<commit_message>
Add UI screenshots to user manual
</commit_message>
<xml_diff>
--- a/docs/Signal_Canvas_User_Manual_KO.docx
+++ b/docs/Signal_Canvas_User_Manual_KO.docx
@@ -1049,6 +1049,57 @@
       </w:pPr>
     </w:p>
     <w:p>
+      <w:pPr>
+        <w:spacing w:after="100"/>
+        <w:jc w:val="center"/>
+      </w:pPr>
+      <w:r>
+        <w:drawing>
+          <wp:inline xmlns:a="http://schemas.openxmlformats.org/drawingml/2006/main" xmlns:pic="http://schemas.openxmlformats.org/drawingml/2006/picture">
+            <wp:extent cx="5940000" cy="4083750"/>
+            <wp:docPr id="1" name="Picture 1"/>
+            <wp:cNvGraphicFramePr>
+              <a:graphicFrameLocks noChangeAspect="1"/>
+            </wp:cNvGraphicFramePr>
+            <a:graphic>
+              <a:graphicData uri="http://schemas.openxmlformats.org/drawingml/2006/picture">
+                <pic:pic>
+                  <pic:nvPicPr>
+                    <pic:cNvPr id="0" name="ui-overview.png"/>
+                    <pic:cNvPicPr/>
+                  </pic:nvPicPr>
+                  <pic:blipFill>
+                    <a:blip r:embed="rId12"/>
+                    <a:stretch>
+                      <a:fillRect/>
+                    </a:stretch>
+                  </pic:blipFill>
+                  <pic:spPr>
+                    <a:xfrm>
+                      <a:off x="0" y="0"/>
+                      <a:ext cx="5940000" cy="4083750"/>
+                    </a:xfrm>
+                    <a:prstGeom prst="rect"/>
+                  </pic:spPr>
+                </pic:pic>
+              </a:graphicData>
+            </a:graphic>
+          </wp:inline>
+        </w:drawing>
+      </w:r>
+    </w:p>
+    <w:p>
+      <w:r>
+        <w:rPr>
+          <w:b/>
+        </w:rPr>
+        <w:t>그림 1. Signal Canvas UI 화면 구성</w:t>
+      </w:r>
+      <w:r>
+        <w:t xml:space="preserve"> — ① 구역·색상 설정, ② 도면·측정점, ③ 신호 분석·Wi-Fi, ④ 측정값·결과 저장 영역으로 구성됩니다.</w:t>
+      </w:r>
+    </w:p>
+    <w:p>
       <w:r>
         <w:t>작업 도구는 다음 네 가지입니다.</w:t>
       </w:r>
@@ -1107,6 +1158,57 @@
       </w:r>
       <w:r>
         <w:t>: 공유기 위치를 클릭하여 표시하고 드래그하여 이동</w:t>
+      </w:r>
+    </w:p>
+    <w:p>
+      <w:pPr>
+        <w:spacing w:after="100"/>
+        <w:jc w:val="center"/>
+      </w:pPr>
+      <w:r>
+        <w:drawing>
+          <wp:inline xmlns:a="http://schemas.openxmlformats.org/drawingml/2006/main" xmlns:pic="http://schemas.openxmlformats.org/drawingml/2006/picture">
+            <wp:extent cx="5940000" cy="2574000"/>
+            <wp:docPr id="2" name="Picture 2"/>
+            <wp:cNvGraphicFramePr>
+              <a:graphicFrameLocks noChangeAspect="1"/>
+            </wp:cNvGraphicFramePr>
+            <a:graphic>
+              <a:graphicData uri="http://schemas.openxmlformats.org/drawingml/2006/picture">
+                <pic:pic>
+                  <pic:nvPicPr>
+                    <pic:cNvPr id="0" name="measurement-workflow.png"/>
+                    <pic:cNvPicPr/>
+                  </pic:nvPicPr>
+                  <pic:blipFill>
+                    <a:blip r:embed="rId13"/>
+                    <a:stretch>
+                      <a:fillRect/>
+                    </a:stretch>
+                  </pic:blipFill>
+                  <pic:spPr>
+                    <a:xfrm>
+                      <a:off x="0" y="0"/>
+                      <a:ext cx="5940000" cy="2574000"/>
+                    </a:xfrm>
+                    <a:prstGeom prst="rect"/>
+                  </pic:spPr>
+                </pic:pic>
+              </a:graphicData>
+            </a:graphic>
+          </wp:inline>
+        </w:drawing>
+      </w:r>
+    </w:p>
+    <w:p>
+      <w:r>
+        <w:rPr>
+          <w:b/>
+        </w:rPr>
+        <w:t>그림 2. 기본 측정 흐름</w:t>
+      </w:r>
+      <w:r>
+        <w:t xml:space="preserve"> — 도면 업로드부터 결과 저장까지 왼쪽에서 오른쪽 순서로 진행합니다.</w:t>
       </w:r>
     </w:p>
     <w:p>

</xml_diff>

<commit_message>
Add step-by-step UI screenshots
</commit_message>
<xml_diff>
--- a/docs/Signal_Canvas_User_Manual_KO.docx
+++ b/docs/Signal_Canvas_User_Manual_KO.docx
@@ -1759,6 +1759,57 @@
     </w:p>
     <w:p>
       <w:pPr>
+        <w:spacing w:after="100"/>
+        <w:jc w:val="center"/>
+      </w:pPr>
+      <w:r>
+        <w:drawing>
+          <wp:inline xmlns:a="http://schemas.openxmlformats.org/drawingml/2006/main" xmlns:pic="http://schemas.openxmlformats.org/drawingml/2006/picture">
+            <wp:extent cx="5940000" cy="4083750"/>
+            <wp:docPr id="3" name="Picture 3"/>
+            <wp:cNvGraphicFramePr>
+              <a:graphicFrameLocks noChangeAspect="1"/>
+            </wp:cNvGraphicFramePr>
+            <a:graphic>
+              <a:graphicData uri="http://schemas.openxmlformats.org/drawingml/2006/picture">
+                <pic:pic>
+                  <pic:nvPicPr>
+                    <pic:cNvPr id="0" name="ui-step-boundary.png"/>
+                    <pic:cNvPicPr/>
+                  </pic:nvPicPr>
+                  <pic:blipFill>
+                    <a:blip r:embed="rId14"/>
+                    <a:stretch>
+                      <a:fillRect/>
+                    </a:stretch>
+                  </pic:blipFill>
+                  <pic:spPr>
+                    <a:xfrm>
+                      <a:off x="0" y="0"/>
+                      <a:ext cx="5940000" cy="4083750"/>
+                    </a:xfrm>
+                    <a:prstGeom prst="rect"/>
+                  </pic:spPr>
+                </pic:pic>
+              </a:graphicData>
+            </a:graphic>
+          </wp:inline>
+        </w:drawing>
+      </w:r>
+    </w:p>
+    <w:p>
+      <w:r>
+        <w:rPr>
+          <w:b/>
+        </w:rPr>
+        <w:t>그림 3. 다각형 측정 구역 설정 완료</w:t>
+      </w:r>
+      <w:r>
+        <w:t xml:space="preserve"> — 84A 도면 위에 4개의 경계점을 지정한 예입니다. 경계점은 필요한 만큼 더 추가할 수 있습니다.</w:t>
+      </w:r>
+    </w:p>
+    <w:p>
+      <w:pPr>
         <w:pStyle w:val="Heading3"/>
       </w:pPr>
       <w:r>
@@ -1951,6 +2002,57 @@
       </w:r>
       <w:r>
         <w:t>을 누른 뒤 다시 스캔합니다.</w:t>
+      </w:r>
+    </w:p>
+    <w:p>
+      <w:pPr>
+        <w:spacing w:after="100"/>
+        <w:jc w:val="center"/>
+      </w:pPr>
+      <w:r>
+        <w:drawing>
+          <wp:inline xmlns:a="http://schemas.openxmlformats.org/drawingml/2006/main" xmlns:pic="http://schemas.openxmlformats.org/drawingml/2006/picture">
+            <wp:extent cx="2592000" cy="7986600"/>
+            <wp:docPr id="4" name="Picture 4"/>
+            <wp:cNvGraphicFramePr>
+              <a:graphicFrameLocks noChangeAspect="1"/>
+            </wp:cNvGraphicFramePr>
+            <a:graphic>
+              <a:graphicData uri="http://schemas.openxmlformats.org/drawingml/2006/picture">
+                <pic:pic>
+                  <pic:nvPicPr>
+                    <pic:cNvPr id="0" name="ui-step-wifi-ap.png"/>
+                    <pic:cNvPicPr/>
+                  </pic:nvPicPr>
+                  <pic:blipFill>
+                    <a:blip r:embed="rId15"/>
+                    <a:stretch>
+                      <a:fillRect/>
+                    </a:stretch>
+                  </pic:blipFill>
+                  <pic:spPr>
+                    <a:xfrm>
+                      <a:off x="0" y="0"/>
+                      <a:ext cx="2592000" cy="7986600"/>
+                    </a:xfrm>
+                    <a:prstGeom prst="rect"/>
+                  </pic:spPr>
+                </pic:pic>
+              </a:graphicData>
+            </a:graphic>
+          </wp:inline>
+        </w:drawing>
+      </w:r>
+    </w:p>
+    <w:p>
+      <w:r>
+        <w:rPr>
+          <w:b/>
+        </w:rPr>
+        <w:t>그림 4. AP 선택 화면</w:t>
+      </w:r>
+      <w:r>
+        <w:t xml:space="preserve"> — SSID가 같더라도 BSSID를 함께 확인하고, 현재 RSSI와 채널을 기준으로 측정할 AP를 선택합니다. 화면의 AP 정보는 매뉴얼용 데모 데이터입니다.</w:t>
       </w:r>
     </w:p>
     <w:p>
@@ -2351,10 +2453,123 @@
     </w:p>
     <w:p>
       <w:pPr>
+        <w:spacing w:after="100"/>
+        <w:jc w:val="center"/>
+      </w:pPr>
+      <w:r>
+        <w:drawing>
+          <wp:inline xmlns:a="http://schemas.openxmlformats.org/drawingml/2006/main" xmlns:pic="http://schemas.openxmlformats.org/drawingml/2006/picture">
+            <wp:extent cx="5940000" cy="5798851"/>
+            <wp:docPr id="5" name="Picture 5"/>
+            <wp:cNvGraphicFramePr>
+              <a:graphicFrameLocks noChangeAspect="1"/>
+            </wp:cNvGraphicFramePr>
+            <a:graphic>
+              <a:graphicData uri="http://schemas.openxmlformats.org/drawingml/2006/picture">
+                <pic:pic>
+                  <pic:nvPicPr>
+                    <pic:cNvPr id="0" name="ui-step-heatmap.png"/>
+                    <pic:cNvPicPr/>
+                  </pic:nvPicPr>
+                  <pic:blipFill>
+                    <a:blip r:embed="rId16"/>
+                    <a:stretch>
+                      <a:fillRect/>
+                    </a:stretch>
+                  </pic:blipFill>
+                  <pic:spPr>
+                    <a:xfrm>
+                      <a:off x="0" y="0"/>
+                      <a:ext cx="5940000" cy="5798851"/>
+                    </a:xfrm>
+                    <a:prstGeom prst="rect"/>
+                  </pic:spPr>
+                </pic:pic>
+              </a:graphicData>
+            </a:graphic>
+          </wp:inline>
+        </w:drawing>
+      </w:r>
+    </w:p>
+    <w:p>
+      <w:r>
+        <w:rPr>
+          <w:b/>
+        </w:rPr>
+        <w:t>그림 5. RSSI 측정점과 IDW 히트맵</w:t>
+      </w:r>
+      <w:r>
+        <w:t xml:space="preserve"> — </w:t>
+      </w:r>
+      <w:r>
+        <w:rPr>
+          <w:rFonts w:ascii="Consolas" w:hAnsi="Consolas"/>
+          <w:color w:val="1E40AF"/>
+          <w:sz w:val="19"/>
+        </w:rPr>
+        <w:t>-42~-78 dBm</w:t>
+      </w:r>
+      <w:r>
+        <w:t>의 데모 측정점 6개를 사용한 결과입니다. 초록색은 상대적으로 강한 영역, 주황색은 약한 영역을 나타냅니다.</w:t>
+      </w:r>
+    </w:p>
+    <w:p>
+      <w:pPr>
         <w:pStyle w:val="Heading2"/>
       </w:pPr>
       <w:r>
         <w:t>8. 결과 저장</w:t>
+      </w:r>
+    </w:p>
+    <w:p>
+      <w:pPr>
+        <w:spacing w:after="100"/>
+        <w:jc w:val="center"/>
+      </w:pPr>
+      <w:r>
+        <w:drawing>
+          <wp:inline xmlns:a="http://schemas.openxmlformats.org/drawingml/2006/main" xmlns:pic="http://schemas.openxmlformats.org/drawingml/2006/picture">
+            <wp:extent cx="5940000" cy="4083750"/>
+            <wp:docPr id="6" name="Picture 6"/>
+            <wp:cNvGraphicFramePr>
+              <a:graphicFrameLocks noChangeAspect="1"/>
+            </wp:cNvGraphicFramePr>
+            <a:graphic>
+              <a:graphicData uri="http://schemas.openxmlformats.org/drawingml/2006/picture">
+                <pic:pic>
+                  <pic:nvPicPr>
+                    <pic:cNvPr id="0" name="ui-step-complete.png"/>
+                    <pic:cNvPicPr/>
+                  </pic:nvPicPr>
+                  <pic:blipFill>
+                    <a:blip r:embed="rId17"/>
+                    <a:stretch>
+                      <a:fillRect/>
+                    </a:stretch>
+                  </pic:blipFill>
+                  <pic:spPr>
+                    <a:xfrm>
+                      <a:off x="0" y="0"/>
+                      <a:ext cx="5940000" cy="4083750"/>
+                    </a:xfrm>
+                    <a:prstGeom prst="rect"/>
+                  </pic:spPr>
+                </pic:pic>
+              </a:graphicData>
+            </a:graphic>
+          </wp:inline>
+        </w:drawing>
+      </w:r>
+    </w:p>
+    <w:p>
+      <w:r>
+        <w:rPr>
+          <w:b/>
+        </w:rPr>
+        <w:t>그림 6. 측정 완료 화면</w:t>
+      </w:r>
+      <w:r>
+        <w:t xml:space="preserve"> — 다각형 경계, 공유기 위치, AP의 SSID·BSSID, RSSI 측정점, 히트맵과 결과 저장 버튼을 한 화면에서 확인할 수 있습니다.</w:t>
       </w:r>
     </w:p>
     <w:p>

</xml_diff>